<commit_message>
Add GitHub Pages site
</commit_message>
<xml_diff>
--- a/outs/team_brief_v2.docx
+++ b/outs/team_brief_v2.docx
@@ -1004,16 +1004,22 @@
         <w:t xml:space="preserve"> </w:t>
       </w:r>
       <w:r>
-        <w:t xml:space="preserve">FTE, rural behavioral health”</w:t>
-      </w:r>
-      <w:r>
-        <w:t xml:space="preserve">) and the tool reconfigures itself, showing exactly which settings it</w:t>
-      </w:r>
-      <w:r>
-        <w:t xml:space="preserve"> </w:t>
-      </w:r>
-      <w:r>
-        <w:t xml:space="preserve">changed.</w:t>
+        <w:t xml:space="preserve">FTE, awards of at least $250k, rural behavioral health, reach the most people”</w:t>
+      </w:r>
+      <w:r>
+        <w:t xml:space="preserve">) and the tool</w:t>
+      </w:r>
+      <w:r>
+        <w:t xml:space="preserve"> </w:t>
+      </w:r>
+      <w:r>
+        <w:t xml:space="preserve">reconfigures itself (runway, match, staff, minimum award, what matters most for impact), showing</w:t>
+      </w:r>
+      <w:r>
+        <w:t xml:space="preserve"> </w:t>
+      </w:r>
+      <w:r>
+        <w:t xml:space="preserve">exactly which settings it changed.</w:t>
       </w:r>
     </w:p>
     <w:p>
@@ -2821,7 +2827,35 @@
           <w:i/>
           <w:iCs/>
         </w:rPr>
-        <w:t xml:space="preserve">The full data dictionary is in section 4 of the notebook, with counts computed from the file.</w:t>
+        <w:t xml:space="preserve">The full data dictionary is in section 4 of the notebook, with counts computed from the file. The</w:t>
+      </w:r>
+      <w:r>
+        <w:rPr>
+          <w:i/>
+          <w:iCs/>
+        </w:rPr>
+        <w:t xml:space="preserve"> </w:t>
+      </w:r>
+      <w:r>
+        <w:rPr>
+          <w:i/>
+          <w:iCs/>
+        </w:rPr>
+        <w:t xml:space="preserve">notebook now has a chart for every dataset we used (27 in all), each followed by a one-line</w:t>
+      </w:r>
+      <w:r>
+        <w:rPr>
+          <w:i/>
+          <w:iCs/>
+        </w:rPr>
+        <w:t xml:space="preserve"> </w:t>
+      </w:r>
+      <w:r>
+        <w:rPr>
+          <w:i/>
+          <w:iCs/>
+        </w:rPr>
+        <w:t xml:space="preserve">takeaway in plain language; section 4 lists which chart shows which dataset.</w:t>
       </w:r>
     </w:p>
     <w:bookmarkEnd w:id="22"/>

</xml_diff>

<commit_message>
Use Grants.gov awards and deadlines; team sheet; impact breakdown; rename to NC Grants Explorer
</commit_message>
<xml_diff>
--- a/outs/team_brief_v2.docx
+++ b/outs/team_brief_v2.docx
@@ -7,7 +7,7 @@
         <w:pStyle w:val="Title"/>
       </w:pPr>
       <w:r>
-        <w:t xml:space="preserve">Team Brief: NC’s Hidden Treasure (v2)</w:t>
+        <w:t xml:space="preserve">Team Brief: NC Grants Explorer (NC’s Hidden Treasure)</w:t>
       </w:r>
     </w:p>
     <w:p>
@@ -21,6 +21,24 @@
     <w:p>
       <w:pPr>
         <w:pStyle w:val="FirstParagraph"/>
+      </w:pPr>
+      <w:r>
+        <w:rPr>
+          <w:b/>
+          <w:bCs/>
+        </w:rPr>
+        <w:t xml:space="preserve">Team:</w:t>
+      </w:r>
+      <w:r>
+        <w:t xml:space="preserve"> </w:t>
+      </w:r>
+      <w:r>
+        <w:t xml:space="preserve">Kent Lee, Marco Gullotto, Everett Foo, Noah Goldblatt and Matthew Martin.</w:t>
+      </w:r>
+    </w:p>
+    <w:p>
+      <w:pPr>
+        <w:pStyle w:val="BodyText"/>
       </w:pPr>
       <w:r>
         <w:rPr>
@@ -1493,7 +1511,7 @@
           <w:b/>
           <w:bCs/>
         </w:rPr>
-        <w:t xml:space="preserve">23 in Tier 1, 23 in</w:t>
+        <w:t xml:space="preserve">27 in Tier 1, 24 in</w:t>
       </w:r>
       <w:r>
         <w:rPr>
@@ -1510,7 +1528,7 @@
         <w:t xml:space="preserve">Tier 2, 3 in Tier 3</w:t>
       </w:r>
       <w:r>
-        <w:t xml:space="preserve">, plus 365 research awards in Tier 4. Every Tier 1-3 item is in</w:t>
+        <w:t xml:space="preserve">, plus 367 research awards in Tier 4. Every Tier 1-3 item is in</w:t>
       </w:r>
       <w:r>
         <w:t xml:space="preserve"> </w:t>
@@ -2869,7 +2887,7 @@
         <w:t xml:space="preserve"> </w:t>
       </w:r>
       <w:r>
-        <w:t xml:space="preserve">verify the capability profile; standing partner agreements for research and workforce training (17 of 23 Tier 2 items wait on a partner).</w:t>
+        <w:t xml:space="preserve">verify the capability profile; standing partner agreements for research and workforce training (17 of 24 Tier 2 items wait on a partner).</w:t>
       </w:r>
     </w:p>
     <w:p>

</xml_diff>

<commit_message>
Fixing website and other things
</commit_message>
<xml_diff>
--- a/outs/team_brief_v2.docx
+++ b/outs/team_brief_v2.docx
@@ -33,7 +33,7 @@
         <w:t xml:space="preserve"> </w:t>
       </w:r>
       <w:r>
-        <w:t xml:space="preserve">Kent Lee, Marco Gullotto, Everett Foo, Noah Goldblatt and Matthew Martin.</w:t>
+        <w:t xml:space="preserve">Kent Lee, Everett Foo, Marco Gullotto, Matthew Martin and Noah Goldblatt.</w:t>
       </w:r>
     </w:p>
     <w:p>
@@ -1609,25 +1609,88 @@
           <w:b/>
           <w:bCs/>
         </w:rPr>
-        <w:t xml:space="preserve">We can estimate what an applicant actually gets.</w:t>
-      </w:r>
-      <w:r>
-        <w:t xml:space="preserve"> </w:t>
-      </w:r>
-      <w:r>
-        <w:t xml:space="preserve">Total national funding divided by number of awards</w:t>
-      </w:r>
-      <w:r>
-        <w:t xml:space="preserve"> </w:t>
-      </w:r>
-      <w:r>
-        <w:t xml:space="preserve">gives an implied per-award amount: median $750,000. It matches the stated maximum award on the 451</w:t>
-      </w:r>
-      <w:r>
-        <w:t xml:space="preserve"> </w:t>
-      </w:r>
-      <w:r>
-        <w:t xml:space="preserve">opportunities where both exist. Much more honest than quoting the national pot.</w:t>
+        <w:t xml:space="preserve">[UPDATED] What an applicant actually gets comes from Grants.gov.</w:t>
+      </w:r>
+      <w:r>
+        <w:t xml:space="preserve"> </w:t>
+      </w:r>
+      <w:r>
+        <w:t xml:space="preserve">We read each state-eligible</w:t>
+      </w:r>
+      <w:r>
+        <w:t xml:space="preserve"> </w:t>
+      </w:r>
+      <w:r>
+        <w:t xml:space="preserve">opportunity’s current Grants.gov record. The award shown is the ceiling Grants.gov states (351 of</w:t>
+      </w:r>
+      <w:r>
+        <w:t xml:space="preserve"> </w:t>
+      </w:r>
+      <w:r>
+        <w:t xml:space="preserve">872 state one; median $680,000). Where there’s no ceiling, we estimate total funding ÷ expected</w:t>
+      </w:r>
+      <w:r>
+        <w:t xml:space="preserve"> </w:t>
+      </w:r>
+      <w:r>
+        <w:t xml:space="preserve">awards and mark it</w:t>
+      </w:r>
+      <w:r>
+        <w:t xml:space="preserve"> </w:t>
+      </w:r>
+      <w:r>
+        <w:t xml:space="preserve">“est.”</w:t>
+      </w:r>
+      <w:r>
+        <w:t xml:space="preserve">. We checked that estimate against the real ceilings, and it was more than</w:t>
+      </w:r>
+      <w:r>
+        <w:t xml:space="preserve"> </w:t>
+      </w:r>
+      <w:r>
+        <w:t xml:space="preserve">2x off for about a third of them, so a stated ceiling always wins. Deadlines are Grants.gov’s current</w:t>
+      </w:r>
+      <w:r>
+        <w:t xml:space="preserve"> </w:t>
+      </w:r>
+      <w:r>
+        <w:t xml:space="preserve">dates too. Never quote the national pot as money NC could receive.</w:t>
+      </w:r>
+    </w:p>
+    <w:p>
+      <w:pPr>
+        <w:pStyle w:val="BodyText"/>
+      </w:pPr>
+      <w:r>
+        <w:rPr>
+          <w:b/>
+          <w:bCs/>
+        </w:rPr>
+        <w:t xml:space="preserve">[NEW] The impact score is five real numbers.</w:t>
+      </w:r>
+      <w:r>
+        <w:t xml:space="preserve"> </w:t>
+      </w:r>
+      <w:r>
+        <w:t xml:space="preserve">Plan fit, people reached, dollars per person, award</w:t>
+      </w:r>
+      <w:r>
+        <w:t xml:space="preserve"> </w:t>
+      </w:r>
+      <w:r>
+        <w:t xml:space="preserve">size and program priority each earn up to 20 points, and the points add up to the score. Open any</w:t>
+      </w:r>
+      <w:r>
+        <w:t xml:space="preserve"> </w:t>
+      </w:r>
+      <w:r>
+        <w:t xml:space="preserve">card in the tool, or see the top results spreadsheet, to show exactly why an opportunity ranks where</w:t>
+      </w:r>
+      <w:r>
+        <w:t xml:space="preserve"> </w:t>
+      </w:r>
+      <w:r>
+        <w:t xml:space="preserve">it does.</w:t>
       </w:r>
     </w:p>
     <w:p>
@@ -2686,7 +2749,40 @@
         <w:t xml:space="preserve"> </w:t>
       </w:r>
       <w:r>
-        <w:t xml:space="preserve">reach-vs-intensity chart, the top results list with one-line rationales, the full notebook,</w:t>
+        <w:t xml:space="preserve">reach-vs-intensity chart, a</w:t>
+      </w:r>
+      <w:r>
+        <w:t xml:space="preserve"> </w:t>
+      </w:r>
+      <w:r>
+        <w:t xml:space="preserve">“who this reaches”</w:t>
+      </w:r>
+      <w:r>
+        <w:t xml:space="preserve"> </w:t>
+      </w:r>
+      <w:r>
+        <w:t xml:space="preserve">view by county and congressional district, the top</w:t>
+      </w:r>
+      <w:r>
+        <w:t xml:space="preserve"> </w:t>
+      </w:r>
+      <w:r>
+        <w:t xml:space="preserve">results list (</w:t>
+      </w:r>
+      <w:r>
+        <w:rPr>
+          <w:rStyle w:val="VerbatimChar"/>
+        </w:rPr>
+        <w:t xml:space="preserve">top_results_with_rationale.xlsx</w:t>
+      </w:r>
+      <w:r>
+        <w:t xml:space="preserve">: a tab per tier, the impact breakdown and a</w:t>
+      </w:r>
+      <w:r>
+        <w:t xml:space="preserve"> </w:t>
+      </w:r>
+      <w:r>
+        <w:t xml:space="preserve">one-sentence rationale each), the full notebook,</w:t>
       </w:r>
       <w:r>
         <w:t xml:space="preserve"> </w:t>
@@ -2782,13 +2878,19 @@
         <w:t xml:space="preserve"> </w:t>
       </w:r>
       <w:r>
-        <w:t xml:space="preserve">record the video; check the strategic-plan tables and capability profile if time</w:t>
-      </w:r>
-      <w:r>
-        <w:t xml:space="preserve"> </w:t>
-      </w:r>
-      <w:r>
-        <w:t xml:space="preserve">allows.</w:t>
+        <w:t xml:space="preserve">- read the rationales in the top results spreadsheet and fix any you can’t defend;</w:t>
+      </w:r>
+      <w:r>
+        <w:t xml:space="preserve"> </w:t>
+      </w:r>
+      <w:r>
+        <w:t xml:space="preserve">- record the video;</w:t>
+      </w:r>
+      <w:r>
+        <w:t xml:space="preserve"> </w:t>
+      </w:r>
+      <w:r>
+        <w:t xml:space="preserve">- check the strategic-plan tables and capability profile, if time allows.</w:t>
       </w:r>
     </w:p>
     <w:p>

</xml_diff>